<commit_message>
update movement sheet service
</commit_message>
<xml_diff>
--- a/src/templates/template_Sales_Contract_v2.docx
+++ b/src/templates/template_Sales_Contract_v2.docx
@@ -1700,13 +1700,34 @@
               </w:rPr>
               <w:t>{</w:t>
             </w:r>
+            <w:r>
+              <w:rPr>
+                <w:sz w:val="26"/>
+                <w:szCs w:val="26"/>
+              </w:rPr>
+              <w:t>Account</w:t>
+            </w:r>
+            <w:r>
+              <w:rPr>
+                <w:sz w:val="26"/>
+                <w:szCs w:val="26"/>
+              </w:rPr>
+              <w:t>__</w:t>
+            </w:r>
             <w:proofErr w:type="spellStart"/>
             <w:r>
               <w:rPr>
                 <w:sz w:val="26"/>
                 <w:szCs w:val="26"/>
               </w:rPr>
-              <w:t>Account.</w:t>
+              <w:t>c</w:t>
+            </w:r>
+            <w:r>
+              <w:rPr>
+                <w:sz w:val="26"/>
+                <w:szCs w:val="26"/>
+              </w:rPr>
+              <w:t>.</w:t>
             </w:r>
             <w:r>
               <w:rPr>
@@ -1771,7 +1792,21 @@
                 <w:sz w:val="26"/>
                 <w:szCs w:val="26"/>
               </w:rPr>
-              <w:t>Account.</w:t>
+              <w:t>Account</w:t>
+            </w:r>
+            <w:r>
+              <w:rPr>
+                <w:sz w:val="26"/>
+                <w:szCs w:val="26"/>
+              </w:rPr>
+              <w:t>__c</w:t>
+            </w:r>
+            <w:r>
+              <w:rPr>
+                <w:sz w:val="26"/>
+                <w:szCs w:val="26"/>
+              </w:rPr>
+              <w:t>.</w:t>
             </w:r>
             <w:r>
               <w:rPr>

</xml_diff>